<commit_message>
Tighten warning letter clauses to fit one page
Co-Authored-By: Claude Opus 5.5 <noreply@anthropic.com>
Claude-Session: https://claude.ai/code/session_016dUd7MCkP2fMPQNupwWurj
</commit_message>
<xml_diff>
--- a/rental-termination-letter/letter-to-landlord.docx
+++ b/rental-termination-letter/letter-to-landlord.docx
@@ -5,13 +5,13 @@
     <w:p>
       <w:pPr>
         <w:bidi/>
-        <w:spacing w:after="0" w:before="0" w:line="300"/>
-      </w:pPr>
-      <w:r>
-        <w:rPr>
-          <w:rFonts w:ascii="Arial" w:cs="Arial" w:hAnsi="Arial"/>
-          <w:sz w:val="24"/>
-          <w:szCs w:val="24"/>
+        <w:spacing w:after="0" w:before="0" w:line="276"/>
+      </w:pPr>
+      <w:r>
+        <w:rPr>
+          <w:rFonts w:ascii="Arial" w:cs="Arial" w:hAnsi="Arial"/>
+          <w:sz w:val="22"/>
+          <w:szCs w:val="22"/>
           <w:rtl/>
         </w:rPr>
         <w:t xml:space="preserve">לכבוד</w:t>
@@ -20,13 +20,13 @@
     <w:p>
       <w:pPr>
         <w:bidi/>
-        <w:spacing w:after="0" w:before="0" w:line="300"/>
-      </w:pPr>
-      <w:r>
-        <w:rPr>
-          <w:rFonts w:ascii="Arial" w:cs="Arial" w:hAnsi="Arial"/>
-          <w:sz w:val="24"/>
-          <w:szCs w:val="24"/>
+        <w:spacing w:after="0" w:before="0" w:line="276"/>
+      </w:pPr>
+      <w:r>
+        <w:rPr>
+          <w:rFonts w:ascii="Arial" w:cs="Arial" w:hAnsi="Arial"/>
+          <w:sz w:val="22"/>
+          <w:szCs w:val="22"/>
           <w:rtl/>
         </w:rPr>
         <w:t xml:space="preserve">גב' נירית דביר</w:t>
@@ -35,13 +35,13 @@
     <w:p>
       <w:pPr>
         <w:bidi/>
-        <w:spacing w:after="0" w:before="0" w:line="300"/>
-      </w:pPr>
-      <w:r>
-        <w:rPr>
-          <w:rFonts w:ascii="Arial" w:cs="Arial" w:hAnsi="Arial"/>
-          <w:sz w:val="24"/>
-          <w:szCs w:val="24"/>
+        <w:spacing w:after="0" w:before="0" w:line="276"/>
+      </w:pPr>
+      <w:r>
+        <w:rPr>
+          <w:rFonts w:ascii="Arial" w:cs="Arial" w:hAnsi="Arial"/>
+          <w:sz w:val="22"/>
+          <w:szCs w:val="22"/>
           <w:rtl/>
         </w:rPr>
         <w:t xml:space="preserve">רח' הרקפת 13, כפר יונה</w:t>
@@ -50,13 +50,13 @@
     <w:p>
       <w:pPr>
         <w:bidi/>
-        <w:spacing w:after="0" w:before="0" w:line="300"/>
-      </w:pPr>
-      <w:r>
-        <w:rPr>
-          <w:rFonts w:ascii="Arial" w:cs="Arial" w:hAnsi="Arial"/>
-          <w:sz w:val="24"/>
-          <w:szCs w:val="24"/>
+        <w:spacing w:after="0" w:before="0" w:line="276"/>
+      </w:pPr>
+      <w:r>
+        <w:rPr>
+          <w:rFonts w:ascii="Arial" w:cs="Arial" w:hAnsi="Arial"/>
+          <w:sz w:val="22"/>
+          <w:szCs w:val="22"/>
           <w:rtl/>
         </w:rPr>
         <w:t xml:space="preserve">בדוא"ל: niritdvir@gmail.com ובוואטסאפ</w:t>
@@ -65,13 +65,13 @@
     <w:p>
       <w:pPr>
         <w:bidi/>
-        <w:spacing w:after="120" w:before="120" w:line="300"/>
-      </w:pPr>
-      <w:r>
-        <w:rPr>
-          <w:rFonts w:ascii="Arial" w:cs="Arial" w:hAnsi="Arial"/>
-          <w:sz w:val="24"/>
-          <w:szCs w:val="24"/>
+        <w:spacing w:after="120" w:before="120" w:line="276"/>
+      </w:pPr>
+      <w:r>
+        <w:rPr>
+          <w:rFonts w:ascii="Arial" w:cs="Arial" w:hAnsi="Arial"/>
+          <w:sz w:val="22"/>
+          <w:szCs w:val="22"/>
           <w:rtl/>
         </w:rPr>
         <w:t xml:space="preserve">תאריך: 21.10.2026</w:t>
@@ -80,7 +80,7 @@
     <w:p>
       <w:pPr>
         <w:bidi/>
-        <w:spacing w:after="240" w:before="240" w:line="300"/>
+        <w:spacing w:after="240" w:before="240" w:line="276"/>
         <w:jc w:val="center"/>
       </w:pPr>
       <w:r>
@@ -88,8 +88,8 @@
           <w:rFonts w:ascii="Arial" w:cs="Arial" w:hAnsi="Arial"/>
           <w:b/>
           <w:bCs/>
-          <w:sz w:val="24"/>
-          <w:szCs w:val="24"/>
+          <w:sz w:val="22"/>
+          <w:szCs w:val="22"/>
           <w:u w:val="single"/>
           <w:rtl/>
         </w:rPr>
@@ -99,13 +99,13 @@
     <w:p>
       <w:pPr>
         <w:bidi/>
-        <w:spacing w:after="120" w:before="0" w:line="300"/>
-      </w:pPr>
-      <w:r>
-        <w:rPr>
-          <w:rFonts w:ascii="Arial" w:cs="Arial" w:hAnsi="Arial"/>
-          <w:sz w:val="24"/>
-          <w:szCs w:val="24"/>
+        <w:spacing w:after="120" w:before="0" w:line="276"/>
+      </w:pPr>
+      <w:r>
+        <w:rPr>
+          <w:rFonts w:ascii="Arial" w:cs="Arial" w:hAnsi="Arial"/>
+          <w:sz w:val="22"/>
+          <w:szCs w:val="22"/>
           <w:rtl/>
         </w:rPr>
         <w:t xml:space="preserve">גב' דביר שלום,</w:t>
@@ -114,13 +114,13 @@
     <w:p>
       <w:pPr>
         <w:bidi/>
-        <w:spacing w:after="120" w:before="0" w:line="300"/>
-      </w:pPr>
-      <w:r>
-        <w:rPr>
-          <w:rFonts w:ascii="Arial" w:cs="Arial" w:hAnsi="Arial"/>
-          <w:sz w:val="24"/>
-          <w:szCs w:val="24"/>
+        <w:spacing w:after="120" w:before="0" w:line="276"/>
+      </w:pPr>
+      <w:r>
+        <w:rPr>
+          <w:rFonts w:ascii="Arial" w:cs="Arial" w:hAnsi="Arial"/>
+          <w:sz w:val="22"/>
+          <w:szCs w:val="22"/>
           <w:rtl/>
         </w:rPr>
         <w:t xml:space="preserve">הריני לפנות אלייך כדלקמן:</w:t>
@@ -134,86 +134,86 @@
           <w:numId w:val="2"/>
         </w:numPr>
         <w:bidi/>
-        <w:spacing w:after="160" w:before="0" w:line="300"/>
-        <w:jc w:val="both"/>
-      </w:pPr>
-      <w:r>
-        <w:rPr>
-          <w:rFonts w:ascii="Arial" w:cs="Arial" w:hAnsi="Arial"/>
-          <w:sz w:val="24"/>
-          <w:szCs w:val="24"/>
-          <w:rtl/>
-        </w:rPr>
-        <w:t xml:space="preserve">בהתאם לחוזה השכירות שנחתם בינינו ביום 16.7.2025, תקופת השכירות החלה ביום 1.8.2025 והסתיימה ביום 31.7.2026. ביום 30.7.2026 הודעתי לך שאינני מאריכה את החוזה, ומאחר שההודעה ניתנה בהתראה קצרה, הסכמתי לשלם על חודש אוגוסט 2026 כחודש הודעה מוקדמת ולסייע במהלכו במציאת דייר חלופי. פיניתי את הדירה ביום 24.8.2026, ושילמתי שכירות וחשבונות על חודש אוגוסט במלואו.</w:t>
-      </w:r>
-    </w:p>
-    <w:p>
-      <w:pPr>
-        <w:pStyle w:val="ListParagraph"/>
-        <w:numPr>
-          <w:ilvl w:val="0"/>
-          <w:numId w:val="2"/>
-        </w:numPr>
-        <w:bidi/>
-        <w:spacing w:after="160" w:before="0" w:line="300"/>
-        <w:jc w:val="both"/>
-      </w:pPr>
-      <w:r>
-        <w:rPr>
-          <w:rFonts w:ascii="Arial" w:cs="Arial" w:hAnsi="Arial"/>
-          <w:sz w:val="24"/>
-          <w:szCs w:val="24"/>
-          <w:rtl/>
-        </w:rPr>
-        <w:t xml:space="preserve">מיום ההודעה פרסמתי את הדירה ביותר מ-30 קבוצות בפייסבוק, ביד 2 ובין חברים, העברתי לך רשימה של כ-35 קבוצות פרסום, והראיתי את הדירה למתעניינים עד יום הפינוי. גם לאחר שעזבתי המשכתי לפרסם את הדירה ולהפנות אלייך מתעניינים.</w:t>
-      </w:r>
-    </w:p>
-    <w:p>
-      <w:pPr>
-        <w:pStyle w:val="ListParagraph"/>
-        <w:numPr>
-          <w:ilvl w:val="0"/>
-          <w:numId w:val="2"/>
-        </w:numPr>
-        <w:bidi/>
-        <w:spacing w:after="160" w:before="0" w:line="300"/>
-        <w:jc w:val="both"/>
-      </w:pPr>
-      <w:r>
-        <w:rPr>
-          <w:rFonts w:ascii="Arial" w:cs="Arial" w:hAnsi="Arial"/>
-          <w:sz w:val="24"/>
-          <w:szCs w:val="24"/>
-          <w:rtl/>
-        </w:rPr>
-        <w:t xml:space="preserve">בשיחת טלפון ביום 4.9.2026 סוכם בינינו כי אשלם גם את דמי השכירות לחודש ספטמבר 2026, ללא ארנונה, מים וחשמל, ובכך אשוחרר מכל התחייבות נוספת. אמרת במפורש: "תשלמי לי את ספטמבר, ואני משחררת אותך מההסכם", וכן: "רק שתדעי, אני משחררת אותך". עוד סוכם כי אם ייכנס דייר במהלך ספטמבר, יוחזר לי החלק היחסי, וכי תחזירי לי את הצ'קים. לגבי הצ'קים אמרת: "אני אקרע אותם ואני אשלח לך תמונה של הכל קרוע ותבואי לקחת", ו"התייחסי לזה כאל סגור".</w:t>
-      </w:r>
-    </w:p>
-    <w:p>
-      <w:pPr>
-        <w:pStyle w:val="ListParagraph"/>
-        <w:numPr>
-          <w:ilvl w:val="0"/>
-          <w:numId w:val="2"/>
-        </w:numPr>
-        <w:bidi/>
-        <w:spacing w:after="160" w:before="0" w:line="300"/>
-        <w:jc w:val="both"/>
-      </w:pPr>
-      <w:r>
-        <w:rPr>
-          <w:rFonts w:ascii="Arial" w:cs="Arial" w:hAnsi="Arial"/>
-          <w:sz w:val="24"/>
-          <w:szCs w:val="24"/>
-          <w:rtl/>
-        </w:rPr>
-        <w:t xml:space="preserve">אני עמדתי בכל התחייבויותיי. לבקשתך המשכתי לפרסם את הדירה לאורך כל חודש ספטמבר. ביקשתי ממך שוב ושוב לקבוע מועד למסירת המפתח ולהשבת הצ'קים, ולא נעניתי. כדי שלא יהיה כל ספק שאני עומדת בחלקי, העברתי היום לחשבונך </w:t>
-      </w:r>
-      <w:r>
-        <w:rPr>
-          <w:rFonts w:ascii="Arial" w:cs="Arial" w:hAnsi="Arial"/>
-          <w:sz w:val="24"/>
-          <w:szCs w:val="24"/>
+        <w:spacing w:after="160" w:before="0" w:line="276"/>
+        <w:jc w:val="both"/>
+      </w:pPr>
+      <w:r>
+        <w:rPr>
+          <w:rFonts w:ascii="Arial" w:cs="Arial" w:hAnsi="Arial"/>
+          <w:sz w:val="22"/>
+          <w:szCs w:val="22"/>
+          <w:rtl/>
+        </w:rPr>
+        <w:t xml:space="preserve">תקופת השכירות לפי החוזה מיום 16.7.2025 הסתיימה ביום 31.7.2026. ביום 30.7.2026 הודעתי לך שאינני מאריכה את החוזה, ובשל ההתראה הקצרה שילמתי את חודש אוגוסט במלואו, כולל חשבונות, כחודש הודעה מוקדמת, אף שפיניתי את הדירה ביום 24.8.2026.</w:t>
+      </w:r>
+    </w:p>
+    <w:p>
+      <w:pPr>
+        <w:pStyle w:val="ListParagraph"/>
+        <w:numPr>
+          <w:ilvl w:val="0"/>
+          <w:numId w:val="2"/>
+        </w:numPr>
+        <w:bidi/>
+        <w:spacing w:after="160" w:before="0" w:line="276"/>
+        <w:jc w:val="both"/>
+      </w:pPr>
+      <w:r>
+        <w:rPr>
+          <w:rFonts w:ascii="Arial" w:cs="Arial" w:hAnsi="Arial"/>
+          <w:sz w:val="22"/>
+          <w:szCs w:val="22"/>
+          <w:rtl/>
+        </w:rPr>
+        <w:t xml:space="preserve">פרסמתי את הדירה ביותר מ-30 קבוצות פייסבוק, ביד 2 ובין חברים, העברתי לך רשימה של כ-35 קבוצות, הראיתי את הדירה עד יום הפינוי והמשכתי לפרסם גם אחריו.</w:t>
+      </w:r>
+    </w:p>
+    <w:p>
+      <w:pPr>
+        <w:pStyle w:val="ListParagraph"/>
+        <w:numPr>
+          <w:ilvl w:val="0"/>
+          <w:numId w:val="2"/>
+        </w:numPr>
+        <w:bidi/>
+        <w:spacing w:after="160" w:before="0" w:line="276"/>
+        <w:jc w:val="both"/>
+      </w:pPr>
+      <w:r>
+        <w:rPr>
+          <w:rFonts w:ascii="Arial" w:cs="Arial" w:hAnsi="Arial"/>
+          <w:sz w:val="22"/>
+          <w:szCs w:val="22"/>
+          <w:rtl/>
+        </w:rPr>
+        <w:t xml:space="preserve">בשיחה ביום 4.9.2026 סוכם כי אשלם את ספטמבר, ללא ארנונה, מים וחשמל, ובכך אשוחרר מכל התחייבות. אמרת במפורש: "תשלמי לי את ספטמבר, ואני משחררת אותך מההסכם". עוד סוכם כי אם ייכנס דייר במהלך ספטמבר יוחזר לי החלק היחסי, וכי תחזירי לי את הצ'קים: "אני אקרע אותם ואני אשלח לך תמונה... התייחסי לזה כאל סגור".</w:t>
+      </w:r>
+    </w:p>
+    <w:p>
+      <w:pPr>
+        <w:pStyle w:val="ListParagraph"/>
+        <w:numPr>
+          <w:ilvl w:val="0"/>
+          <w:numId w:val="2"/>
+        </w:numPr>
+        <w:bidi/>
+        <w:spacing w:after="160" w:before="0" w:line="276"/>
+        <w:jc w:val="both"/>
+      </w:pPr>
+      <w:r>
+        <w:rPr>
+          <w:rFonts w:ascii="Arial" w:cs="Arial" w:hAnsi="Arial"/>
+          <w:sz w:val="22"/>
+          <w:szCs w:val="22"/>
+          <w:rtl/>
+        </w:rPr>
+        <w:t xml:space="preserve">עמדתי בחלקי: פרסמתי את הדירה לאורך כל ספטמבר, כפי שביקשת, וביקשתי שוב ושוב לקבוע מועד למסירת המפתח והשבת הצ'קים, ללא מענה. היום העברתי לחשבונך </w:t>
+      </w:r>
+      <w:r>
+        <w:rPr>
+          <w:rFonts w:ascii="Arial" w:cs="Arial" w:hAnsi="Arial"/>
+          <w:sz w:val="22"/>
+          <w:szCs w:val="22"/>
           <w:highlight w:val="yellow"/>
           <w:highlightCs w:val="yellow"/>
           <w:rtl/>
@@ -223,150 +223,150 @@
       <w:r>
         <w:rPr>
           <w:rFonts w:ascii="Arial" w:cs="Arial" w:hAnsi="Arial"/>
-          <w:sz w:val="24"/>
-          <w:szCs w:val="24"/>
-          <w:rtl/>
-        </w:rPr>
-        <w:t xml:space="preserve"> ₪, דמי השכירות לחודש ספטמבר 2026, כפי שסוכם. בכך שילמתי את כל המגיע ממני, וההתקשרות בינינו הסתיימה.</w:t>
-      </w:r>
-    </w:p>
-    <w:p>
-      <w:pPr>
-        <w:pStyle w:val="ListParagraph"/>
-        <w:numPr>
-          <w:ilvl w:val="0"/>
-          <w:numId w:val="2"/>
-        </w:numPr>
-        <w:bidi/>
-        <w:spacing w:after="160" w:before="0" w:line="300"/>
-        <w:jc w:val="both"/>
-      </w:pPr>
-      <w:r>
-        <w:rPr>
-          <w:rFonts w:ascii="Arial" w:cs="Arial" w:hAnsi="Arial"/>
-          <w:sz w:val="24"/>
-          <w:szCs w:val="24"/>
-          <w:rtl/>
-        </w:rPr>
-        <w:t xml:space="preserve">דרישתך שאמשיך לשלם דמי שכירות על חודש אוקטובר ואילך ולפרסם את הדירה עד שיימצא דייר סותרת במפורש את הסיכום בינינו, שעליו הסתמכתי. אין לדרישה זו כל בסיס, ואני דוחה אותה.</w:t>
-      </w:r>
-    </w:p>
-    <w:p>
-      <w:pPr>
-        <w:pStyle w:val="ListParagraph"/>
-        <w:numPr>
-          <w:ilvl w:val="0"/>
-          <w:numId w:val="2"/>
-        </w:numPr>
-        <w:bidi/>
-        <w:spacing w:after="160" w:before="0" w:line="300"/>
-        <w:jc w:val="both"/>
-      </w:pPr>
-      <w:r>
-        <w:rPr>
-          <w:rFonts w:ascii="Arial" w:cs="Arial" w:hAnsi="Arial"/>
-          <w:sz w:val="24"/>
-          <w:szCs w:val="24"/>
-          <w:rtl/>
-        </w:rPr>
-        <w:t xml:space="preserve">גם בלעדי הסיכום, החוזה הסתיים במועדו ביום 31.7.2026. סעיף 17ב לחוזה, העוסק במציאת דייר חלופי, חל רק כאשר השוכר מבקש לסיים את השכירות "לפני סוף התקופה", ולכן אינו חל כאן כלל. ואף אילו היה חל, סעיף 17א לחוזה קובע כי די בהודעה של 30 יום, ואת חודש אוגוסט נתתי ושילמתי במלואו.</w:t>
-      </w:r>
-    </w:p>
-    <w:p>
-      <w:pPr>
-        <w:pStyle w:val="ListParagraph"/>
-        <w:numPr>
-          <w:ilvl w:val="0"/>
-          <w:numId w:val="2"/>
-        </w:numPr>
-        <w:bidi/>
-        <w:spacing w:after="160" w:before="0" w:line="300"/>
-        <w:jc w:val="both"/>
-      </w:pPr>
-      <w:r>
-        <w:rPr>
-          <w:rFonts w:ascii="Arial" w:cs="Arial" w:hAnsi="Arial"/>
-          <w:sz w:val="24"/>
-          <w:szCs w:val="24"/>
-          <w:rtl/>
-        </w:rPr>
-        <w:t xml:space="preserve">לפי סעיף 13ג לחוזה, צ'ק הביטחון על סך 10,890 ₪, שניתן בערבות אמי, גב' אולגה אוסטרוב, היה אמור להיות מוחזר לי 10 ימים לאחר פינוי הדירה. כל החשבונות שולמו עד יום הפינוי, ובשיחה מיום 4.9.2026 אף התחייבת להחזיר את הצ'קים. מאז חלפו כחודשיים, והצ'קים טרם הוחזרו. את דמי השכירות שילמתי בהעברות בנקאיות, ולכן אין כל בסיס להמשיך להחזיק בצ'קי השכירות, וכל הפקדה שלהם תהווה גבייה כפולה של חוב ששולם.</w:t>
-      </w:r>
-    </w:p>
-    <w:p>
-      <w:pPr>
-        <w:pStyle w:val="ListParagraph"/>
-        <w:numPr>
-          <w:ilvl w:val="0"/>
-          <w:numId w:val="2"/>
-        </w:numPr>
-        <w:bidi/>
-        <w:spacing w:after="160" w:before="0" w:line="300"/>
-        <w:jc w:val="both"/>
-      </w:pPr>
-      <w:r>
-        <w:rPr>
-          <w:rFonts w:ascii="Arial" w:cs="Arial" w:hAnsi="Arial"/>
-          <w:sz w:val="24"/>
-          <w:szCs w:val="24"/>
-          <w:rtl/>
-        </w:rPr>
-        <w:t xml:space="preserve">לפיכך, הנך נדרשת להשיב לידיי, או לידי אמי, את צ'ק הביטחון ואת כל צ'קי השכירות שבידייך, לא יאוחר מיום 28.10.2026. ככל שתבחרי לקרוע את צ'קי השכירות, כפי שהצעת, הנך נדרשת לשלוח לי תמונה שלהם קרועים ואישור בכתב שלא נותרו בידייך צ'קים נוספים.</w:t>
-      </w:r>
-    </w:p>
-    <w:p>
-      <w:pPr>
-        <w:pStyle w:val="ListParagraph"/>
-        <w:numPr>
-          <w:ilvl w:val="0"/>
-          <w:numId w:val="2"/>
-        </w:numPr>
-        <w:bidi/>
-        <w:spacing w:after="160" w:before="0" w:line="300"/>
-        <w:jc w:val="both"/>
-      </w:pPr>
-      <w:r>
-        <w:rPr>
-          <w:rFonts w:ascii="Arial" w:cs="Arial" w:hAnsi="Arial"/>
-          <w:sz w:val="24"/>
-          <w:szCs w:val="24"/>
-          <w:rtl/>
-        </w:rPr>
-        <w:t xml:space="preserve">אני מציעה להיפגש בכל מועד שנוח לך עד יום 28.10.2026, כדי שאמסור לך את המפתח ואקבל את הצ'קים. ככל שלא תאשרי מועד עד אז, ביום 29.10.2026 אשאיר את המפתח בתיבת הדואר שלך ברח' הרקפת 13, אתעד זאת ואודיע לך על כך, ומאותו רגע תיחשב החזקה בדירה כמושבת לידייך. המפתח נותר אצלי עד היום אך ורק משום שלא נענית לבקשותיי להיפגש.</w:t>
-      </w:r>
-    </w:p>
-    <w:p>
-      <w:pPr>
-        <w:pStyle w:val="ListParagraph"/>
-        <w:numPr>
-          <w:ilvl w:val="0"/>
-          <w:numId w:val="2"/>
-        </w:numPr>
-        <w:bidi/>
-        <w:spacing w:after="160" w:before="0" w:line="300"/>
-        <w:jc w:val="both"/>
-      </w:pPr>
-      <w:r>
-        <w:rPr>
-          <w:rFonts w:ascii="Arial" w:cs="Arial" w:hAnsi="Arial"/>
-          <w:sz w:val="24"/>
-          <w:szCs w:val="24"/>
-          <w:rtl/>
-        </w:rPr>
-        <w:t xml:space="preserve">אני מצרה על כך שהדברים הגיעו לכדי מכתב זה, לאחר שנה שבה הקפדתי על הדירה, התרעתי על כל ליקוי והמתנתי בסבלנות לתיקונים שבאחריותך לפי סעיף 18 לחוזה, ובהם המדרגה השבורה, הנזילה באסלה ודליפת גג המרפסת, ומבלי שדרשתי על כך כל פיצוי. אמרת בעצמך שהייתי "אחלה של דיירת". עם זאת, ככל שהצ'קים לא יושבו עד המועד הנקוב לעיל, אאלץ לנקוט נגדך בהליכים משפטיים להשבתם, ללא כל התראה נוספת, ועל חשבונך. הדברים שצוטטו לעיל מהשיחה בינינו מתועדים. מכתב זה נשלח בהתאם לסעיף 14 לחוזה, ואין באמור בו כדי לגרוע מכל טענה, זכות או סעד העומדים לי.</w:t>
+          <w:sz w:val="22"/>
+          <w:szCs w:val="22"/>
+          <w:rtl/>
+        </w:rPr>
+        <w:t xml:space="preserve"> ₪ עבור ספטמבר, כפי שסוכם, ובכך ההתקשרות בינינו הסתיימה.</w:t>
+      </w:r>
+    </w:p>
+    <w:p>
+      <w:pPr>
+        <w:pStyle w:val="ListParagraph"/>
+        <w:numPr>
+          <w:ilvl w:val="0"/>
+          <w:numId w:val="2"/>
+        </w:numPr>
+        <w:bidi/>
+        <w:spacing w:after="160" w:before="0" w:line="276"/>
+        <w:jc w:val="both"/>
+      </w:pPr>
+      <w:r>
+        <w:rPr>
+          <w:rFonts w:ascii="Arial" w:cs="Arial" w:hAnsi="Arial"/>
+          <w:sz w:val="22"/>
+          <w:szCs w:val="22"/>
+          <w:rtl/>
+        </w:rPr>
+        <w:t xml:space="preserve">דרישתך לתשלום על אוקטובר ואילך ולהמשך פרסום עד שיימצא דייר סותרת את הסיכום בינינו, ואני דוחה אותה.</w:t>
+      </w:r>
+    </w:p>
+    <w:p>
+      <w:pPr>
+        <w:pStyle w:val="ListParagraph"/>
+        <w:numPr>
+          <w:ilvl w:val="0"/>
+          <w:numId w:val="2"/>
+        </w:numPr>
+        <w:bidi/>
+        <w:spacing w:after="160" w:before="0" w:line="276"/>
+        <w:jc w:val="both"/>
+      </w:pPr>
+      <w:r>
+        <w:rPr>
+          <w:rFonts w:ascii="Arial" w:cs="Arial" w:hAnsi="Arial"/>
+          <w:sz w:val="22"/>
+          <w:szCs w:val="22"/>
+          <w:rtl/>
+        </w:rPr>
+        <w:t xml:space="preserve">גם בלעדי הסיכום, החוזה הסתיים במועדו. סעיף 17ב, העוסק בדייר חלופי, חל רק בסיום השכירות "לפני סוף התקופה", ואף אילו חל, לפי סעיף 17א די בהודעה של 30 יום, וזו ניתנה ושולמה.</w:t>
+      </w:r>
+    </w:p>
+    <w:p>
+      <w:pPr>
+        <w:pStyle w:val="ListParagraph"/>
+        <w:numPr>
+          <w:ilvl w:val="0"/>
+          <w:numId w:val="2"/>
+        </w:numPr>
+        <w:bidi/>
+        <w:spacing w:after="160" w:before="0" w:line="276"/>
+        <w:jc w:val="both"/>
+      </w:pPr>
+      <w:r>
+        <w:rPr>
+          <w:rFonts w:ascii="Arial" w:cs="Arial" w:hAnsi="Arial"/>
+          <w:sz w:val="22"/>
+          <w:szCs w:val="22"/>
+          <w:rtl/>
+        </w:rPr>
+        <w:t xml:space="preserve">לפי סעיף 13ג לחוזה, צ'ק הביטחון על סך 10,890 ₪ (בערבות אמי, גב' אולגה אוסטרוב) היה אמור להיות מוחזר 10 ימים לאחר הפינוי. כל החשבונות שולמו, ואף התחייבת להחזירו, אך חלפו כחודשיים. דמי השכירות שולמו בהעברות בנקאיות, ולכן אין בסיס להחזיק בצ'קי השכירות, והפקדתם תהיה גבייה כפולה.</w:t>
+      </w:r>
+    </w:p>
+    <w:p>
+      <w:pPr>
+        <w:pStyle w:val="ListParagraph"/>
+        <w:numPr>
+          <w:ilvl w:val="0"/>
+          <w:numId w:val="2"/>
+        </w:numPr>
+        <w:bidi/>
+        <w:spacing w:after="160" w:before="0" w:line="276"/>
+        <w:jc w:val="both"/>
+      </w:pPr>
+      <w:r>
+        <w:rPr>
+          <w:rFonts w:ascii="Arial" w:cs="Arial" w:hAnsi="Arial"/>
+          <w:sz w:val="22"/>
+          <w:szCs w:val="22"/>
+          <w:rtl/>
+        </w:rPr>
+        <w:t xml:space="preserve">לפיכך, הנך נדרשת להשיב לידיי או לידי אמי את צ'ק הביטחון ואת כל צ'קי השכירות עד יום 28.10.2026. ככל שתקרעי את צ'קי השכירות, יש לשלוח לי תמונה שלהם ואישור בכתב שלא נותרו בידייך צ'קים נוספים.</w:t>
+      </w:r>
+    </w:p>
+    <w:p>
+      <w:pPr>
+        <w:pStyle w:val="ListParagraph"/>
+        <w:numPr>
+          <w:ilvl w:val="0"/>
+          <w:numId w:val="2"/>
+        </w:numPr>
+        <w:bidi/>
+        <w:spacing w:after="160" w:before="0" w:line="276"/>
+        <w:jc w:val="both"/>
+      </w:pPr>
+      <w:r>
+        <w:rPr>
+          <w:rFonts w:ascii="Arial" w:cs="Arial" w:hAnsi="Arial"/>
+          <w:sz w:val="22"/>
+          <w:szCs w:val="22"/>
+          <w:rtl/>
+        </w:rPr>
+        <w:t xml:space="preserve">אשמח להיפגש עד יום 28.10.2026 כדי למסור את המפתח ולקבל את הצ'קים. אם לא תאשרי מועד, ביום 29.10.2026 אשאיר את המפתח בתיבת הדואר שלך, אתעד ואודיע לך, ומאותו רגע תיחשב החזקה כמושבת לידייך.</w:t>
+      </w:r>
+    </w:p>
+    <w:p>
+      <w:pPr>
+        <w:pStyle w:val="ListParagraph"/>
+        <w:numPr>
+          <w:ilvl w:val="0"/>
+          <w:numId w:val="2"/>
+        </w:numPr>
+        <w:bidi/>
+        <w:spacing w:after="160" w:before="0" w:line="276"/>
+        <w:jc w:val="both"/>
+      </w:pPr>
+      <w:r>
+        <w:rPr>
+          <w:rFonts w:ascii="Arial" w:cs="Arial" w:hAnsi="Arial"/>
+          <w:sz w:val="22"/>
+          <w:szCs w:val="22"/>
+          <w:rtl/>
+        </w:rPr>
+        <w:t xml:space="preserve">במשך כל התקופה שמרתי על הדירה והמתנתי בסבלנות לתיקונים שבאחריותך לפי סעיף 18 לחוזה (המדרגה השבורה, הנזילה באסלה ודליפת גג המרפסת), בלי לדרוש פיצוי. אם הצ'קים לא יושבו במועד, אנקוט נגדך בהליכים משפטיים ללא התראה נוספת ועל חשבונך. הדברים שצוטטו מהשיחה מתועדים. מכתב זה נשלח לפי סעיף 14 לחוזה, ואין בו כדי לגרוע מכל זכות או טענה העומדות לי.</w:t>
       </w:r>
     </w:p>
     <w:p>
       <w:pPr>
         <w:keepNext/>
         <w:bidi/>
-        <w:spacing w:after="480" w:before="240" w:line="300"/>
-      </w:pPr>
-      <w:r>
-        <w:rPr>
-          <w:rFonts w:ascii="Arial" w:cs="Arial" w:hAnsi="Arial"/>
-          <w:sz w:val="24"/>
-          <w:szCs w:val="24"/>
+        <w:spacing w:after="360" w:before="200" w:line="276"/>
+      </w:pPr>
+      <w:r>
+        <w:rPr>
+          <w:rFonts w:ascii="Arial" w:cs="Arial" w:hAnsi="Arial"/>
+          <w:sz w:val="22"/>
+          <w:szCs w:val="22"/>
           <w:rtl/>
         </w:rPr>
         <w:t xml:space="preserve">בכבוד רב,</w:t>
@@ -376,13 +376,13 @@
       <w:pPr>
         <w:keepNext/>
         <w:bidi/>
-        <w:spacing w:after="0" w:before="0" w:line="300"/>
-      </w:pPr>
-      <w:r>
-        <w:rPr>
-          <w:rFonts w:ascii="Arial" w:cs="Arial" w:hAnsi="Arial"/>
-          <w:sz w:val="24"/>
-          <w:szCs w:val="24"/>
+        <w:spacing w:after="0" w:before="0" w:line="276"/>
+      </w:pPr>
+      <w:r>
+        <w:rPr>
+          <w:rFonts w:ascii="Arial" w:cs="Arial" w:hAnsi="Arial"/>
+          <w:sz w:val="22"/>
+          <w:szCs w:val="22"/>
           <w:rtl/>
         </w:rPr>
         <w:t xml:space="preserve">ויקטוריה לינוי אוסטרוב</w:t>
@@ -392,13 +392,13 @@
       <w:pPr>
         <w:keepNext/>
         <w:bidi/>
-        <w:spacing w:after="0" w:before="0" w:line="300"/>
-      </w:pPr>
-      <w:r>
-        <w:rPr>
-          <w:rFonts w:ascii="Arial" w:cs="Arial" w:hAnsi="Arial"/>
-          <w:sz w:val="24"/>
-          <w:szCs w:val="24"/>
+        <w:spacing w:after="0" w:before="0" w:line="276"/>
+      </w:pPr>
+      <w:r>
+        <w:rPr>
+          <w:rFonts w:ascii="Arial" w:cs="Arial" w:hAnsi="Arial"/>
+          <w:sz w:val="22"/>
+          <w:szCs w:val="22"/>
           <w:rtl/>
         </w:rPr>
         <w:t xml:space="preserve">טל': 054-7252533</w:t>
@@ -408,13 +408,13 @@
       <w:pPr>
         <w:keepNext/>
         <w:bidi/>
-        <w:spacing w:after="0" w:before="0" w:line="300"/>
-      </w:pPr>
-      <w:r>
-        <w:rPr>
-          <w:rFonts w:ascii="Arial" w:cs="Arial" w:hAnsi="Arial"/>
-          <w:sz w:val="24"/>
-          <w:szCs w:val="24"/>
+        <w:spacing w:after="0" w:before="0" w:line="276"/>
+      </w:pPr>
+      <w:r>
+        <w:rPr>
+          <w:rFonts w:ascii="Arial" w:cs="Arial" w:hAnsi="Arial"/>
+          <w:sz w:val="22"/>
+          <w:szCs w:val="22"/>
           <w:rtl/>
         </w:rPr>
         <w:t xml:space="preserve">ostrovviki@gmail.com</w:t>
@@ -423,7 +423,7 @@
     <w:sectPr>
       <w:footerReference w:type="default" r:id="rId7"/>
       <w:pgSz w:w="11906" w:h="16838" w:orient="portrait"/>
-      <w:pgMar w:top="1300" w:right="1300" w:bottom="1300" w:left="1300" w:header="708" w:footer="708" w:gutter="0"/>
+      <w:pgMar w:top="1000" w:right="1200" w:bottom="1000" w:left="1200" w:header="708" w:footer="708" w:gutter="0"/>
       <w:pgNumType/>
       <w:docGrid w:linePitch="360"/>
     </w:sectPr>
@@ -674,8 +674,8 @@
     <w:rPrDefault>
       <w:rPr>
         <w:rFonts w:ascii="Arial" w:cs="Arial" w:eastAsia="Arial" w:hAnsi="Arial"/>
-        <w:sz w:val="24"/>
-        <w:szCs w:val="24"/>
+        <w:sz w:val="22"/>
+        <w:szCs w:val="22"/>
       </w:rPr>
     </w:rPrDefault>
     <w:pPrDefault/>

</xml_diff>

<commit_message>
Replace warning letter with September payment and closure letter
Co-Authored-By: Claude Opus 5.5 <noreply@anthropic.com>
Claude-Session: https://claude.ai/code/session_016dUd7MCkP2fMPQNupwWurj
</commit_message>
<xml_diff>
--- a/rental-termination-letter/letter-to-landlord.docx
+++ b/rental-termination-letter/letter-to-landlord.docx
@@ -93,7 +93,7 @@
           <w:u w:val="single"/>
           <w:rtl/>
         </w:rPr>
-        <w:t xml:space="preserve">הנדון: התראה בטרם נקיטת הליכים - השבת הצ'קים וסיום השכירות בדירה ברח' הרקפת 13, כפר יונה</w:t>
+        <w:t xml:space="preserve">הנדון: תשלום דמי שכירות לחודש ספטמבר 2026 וסיום ההתקשרות - הדירה ברח' הרקפת 13, כפר יונה</w:t>
       </w:r>
     </w:p>
     <w:p>
@@ -108,7 +108,7 @@
           <w:szCs w:val="22"/>
           <w:rtl/>
         </w:rPr>
-        <w:t xml:space="preserve">גב' דביר שלום,</w:t>
+        <w:t xml:space="preserve">נירית שלום,</w:t>
       </w:r>
     </w:p>
     <w:p>
@@ -123,7 +123,7 @@
           <w:szCs w:val="22"/>
           <w:rtl/>
         </w:rPr>
-        <w:t xml:space="preserve">הריני לפנות אלייך כדלקמן:</w:t>
+        <w:t xml:space="preserve">בהמשך לפנייתך בעניין דמי השכירות לחודש ספטמבר, הריני להשיב כדלקמן:</w:t>
       </w:r>
     </w:p>
     <w:p>
@@ -144,7 +144,7 @@
           <w:szCs w:val="22"/>
           <w:rtl/>
         </w:rPr>
-        <w:t xml:space="preserve">תקופת השכירות לפי החוזה מיום 16.7.2025 הסתיימה ביום 31.7.2026. ביום 30.7.2026 הודעתי לך שאינני מאריכה את החוזה, ובשל ההתראה הקצרה שילמתי את חודש אוגוסט במלואו, כולל חשבונות, כחודש הודעה מוקדמת, אף שפיניתי את הדירה ביום 24.8.2026.</w:t>
+        <w:t xml:space="preserve">בשיחתנו ביום 4.9.2026 סוכם כי אשלם את דמי השכירות לחודש ספטמבר 2026, ללא ארנונה, מים וחשמל, כסילוק סופי של כל ההתחייבויות שלי, וכי בתמורה תשחררי אותי מהחוזה ותחזירי לי את הצ'קים.</w:t>
       </w:r>
     </w:p>
     <w:p>
@@ -165,7 +165,7 @@
           <w:szCs w:val="22"/>
           <w:rtl/>
         </w:rPr>
-        <w:t xml:space="preserve">פרסמתי את הדירה ביותר מ-30 קבוצות פייסבוק, ביד 2 ובין חברים, העברתי לך רשימה של כ-35 קבוצות, הראיתי את הדירה עד יום הפינוי והמשכתי לפרסם גם אחריו.</w:t>
+        <w:t xml:space="preserve">המפתח נמסר לך, וכל הצ'קים הוחזרו לי, כולל צ'ק הביטחון. תודה על כך.</w:t>
       </w:r>
     </w:p>
     <w:p>
@@ -186,7 +186,27 @@
           <w:szCs w:val="22"/>
           <w:rtl/>
         </w:rPr>
-        <w:t xml:space="preserve">בשיחה ביום 4.9.2026 סוכם כי אשלם את ספטמבר, ללא ארנונה, מים וחשמל, ובכך אשוחרר מכל התחייבות. אמרת במפורש: "תשלמי לי את ספטמבר, ואני משחררת אותך מההסכם". עוד סוכם כי אם ייכנס דייר במהלך ספטמבר יוחזר לי החלק היחסי, וכי תחזירי לי את הצ'קים: "אני אקרע אותם ואני אשלח לך תמונה... התייחסי לזה כאל סגור".</w:t>
+        <w:t xml:space="preserve">בהתאם לסיכום, העברתי היום לחשבונך </w:t>
+      </w:r>
+      <w:r>
+        <w:rPr>
+          <w:rFonts w:ascii="Arial" w:cs="Arial" w:hAnsi="Arial"/>
+          <w:sz w:val="22"/>
+          <w:szCs w:val="22"/>
+          <w:highlight w:val="yellow"/>
+          <w:highlightCs w:val="yellow"/>
+          <w:rtl/>
+        </w:rPr>
+        <w:t xml:space="preserve">______</w:t>
+      </w:r>
+      <w:r>
+        <w:rPr>
+          <w:rFonts w:ascii="Arial" w:cs="Arial" w:hAnsi="Arial"/>
+          <w:sz w:val="22"/>
+          <w:szCs w:val="22"/>
+          <w:rtl/>
+        </w:rPr>
+        <w:t xml:space="preserve"> ₪, דמי השכירות לחודש ספטמבר 2026. התשלום בוצע כעת משום שסוכם שייעשה יחד עם השבת הצ'קים.</w:t>
       </w:r>
     </w:p>
     <w:p>
@@ -207,27 +227,7 @@
           <w:szCs w:val="22"/>
           <w:rtl/>
         </w:rPr>
-        <w:t xml:space="preserve">עמדתי בחלקי: פרסמתי את הדירה לאורך כל ספטמבר, כפי שביקשת, וביקשתי שוב ושוב לקבוע מועד למסירת המפתח והשבת הצ'קים, ללא מענה. היום העברתי לחשבונך </w:t>
-      </w:r>
-      <w:r>
-        <w:rPr>
-          <w:rFonts w:ascii="Arial" w:cs="Arial" w:hAnsi="Arial"/>
-          <w:sz w:val="22"/>
-          <w:szCs w:val="22"/>
-          <w:highlight w:val="yellow"/>
-          <w:highlightCs w:val="yellow"/>
-          <w:rtl/>
-        </w:rPr>
-        <w:t xml:space="preserve">______</w:t>
-      </w:r>
-      <w:r>
-        <w:rPr>
-          <w:rFonts w:ascii="Arial" w:cs="Arial" w:hAnsi="Arial"/>
-          <w:sz w:val="22"/>
-          <w:szCs w:val="22"/>
-          <w:rtl/>
-        </w:rPr>
-        <w:t xml:space="preserve"> ₪ עבור ספטמבר, כפי שסוכם, ובכך ההתקשרות בינינו הסתיימה.</w:t>
+        <w:t xml:space="preserve">ככל שנכנס דייר לדירה במהלך חודש ספטמבר, אבקש את השבת החלק היחסי, כפי שסוכם.</w:t>
       </w:r>
     </w:p>
     <w:p>
@@ -248,7 +248,7 @@
           <w:szCs w:val="22"/>
           <w:rtl/>
         </w:rPr>
-        <w:t xml:space="preserve">דרישתך לתשלום על אוקטובר ואילך ולהמשך פרסום עד שיימצא דייר סותרת את הסיכום בינינו, ואני דוחה אותה.</w:t>
+        <w:t xml:space="preserve">בתשלום זה עמדתי בכל התחייבויותיי לפי החוזה ולפי הסיכום מיום 4.9.2026. ההתקשרות בינינו הסתיימה, ולאף אחת מאיתנו אין טענה או דרישה נוספת כלפי השנייה.</w:t>
       </w:r>
     </w:p>
     <w:p>
@@ -269,91 +269,7 @@
           <w:szCs w:val="22"/>
           <w:rtl/>
         </w:rPr>
-        <w:t xml:space="preserve">גם בלעדי הסיכום, החוזה הסתיים במועדו. סעיף 17ב, העוסק בדייר חלופי, חל רק בסיום השכירות "לפני סוף התקופה", ואף אילו חל, לפי סעיף 17א די בהודעה של 30 יום, וזו ניתנה ושולמה.</w:t>
-      </w:r>
-    </w:p>
-    <w:p>
-      <w:pPr>
-        <w:pStyle w:val="ListParagraph"/>
-        <w:numPr>
-          <w:ilvl w:val="0"/>
-          <w:numId w:val="2"/>
-        </w:numPr>
-        <w:bidi/>
-        <w:spacing w:after="160" w:before="0" w:line="276"/>
-        <w:jc w:val="both"/>
-      </w:pPr>
-      <w:r>
-        <w:rPr>
-          <w:rFonts w:ascii="Arial" w:cs="Arial" w:hAnsi="Arial"/>
-          <w:sz w:val="22"/>
-          <w:szCs w:val="22"/>
-          <w:rtl/>
-        </w:rPr>
-        <w:t xml:space="preserve">לפי סעיף 13ג לחוזה, צ'ק הביטחון על סך 10,890 ₪ (בערבות אמי, גב' אולגה אוסטרוב) היה אמור להיות מוחזר 10 ימים לאחר הפינוי. כל החשבונות שולמו, ואף התחייבת להחזירו, אך חלפו כחודשיים. דמי השכירות שולמו בהעברות בנקאיות, ולכן אין בסיס להחזיק בצ'קי השכירות, והפקדתם תהיה גבייה כפולה.</w:t>
-      </w:r>
-    </w:p>
-    <w:p>
-      <w:pPr>
-        <w:pStyle w:val="ListParagraph"/>
-        <w:numPr>
-          <w:ilvl w:val="0"/>
-          <w:numId w:val="2"/>
-        </w:numPr>
-        <w:bidi/>
-        <w:spacing w:after="160" w:before="0" w:line="276"/>
-        <w:jc w:val="both"/>
-      </w:pPr>
-      <w:r>
-        <w:rPr>
-          <w:rFonts w:ascii="Arial" w:cs="Arial" w:hAnsi="Arial"/>
-          <w:sz w:val="22"/>
-          <w:szCs w:val="22"/>
-          <w:rtl/>
-        </w:rPr>
-        <w:t xml:space="preserve">לפיכך, הנך נדרשת להשיב לידיי או לידי אמי את צ'ק הביטחון ואת כל צ'קי השכירות עד יום 28.10.2026. ככל שתקרעי את צ'קי השכירות, יש לשלוח לי תמונה שלהם ואישור בכתב שלא נותרו בידייך צ'קים נוספים.</w:t>
-      </w:r>
-    </w:p>
-    <w:p>
-      <w:pPr>
-        <w:pStyle w:val="ListParagraph"/>
-        <w:numPr>
-          <w:ilvl w:val="0"/>
-          <w:numId w:val="2"/>
-        </w:numPr>
-        <w:bidi/>
-        <w:spacing w:after="160" w:before="0" w:line="276"/>
-        <w:jc w:val="both"/>
-      </w:pPr>
-      <w:r>
-        <w:rPr>
-          <w:rFonts w:ascii="Arial" w:cs="Arial" w:hAnsi="Arial"/>
-          <w:sz w:val="22"/>
-          <w:szCs w:val="22"/>
-          <w:rtl/>
-        </w:rPr>
-        <w:t xml:space="preserve">אשמח להיפגש עד יום 28.10.2026 כדי למסור את המפתח ולקבל את הצ'קים. אם לא תאשרי מועד, ביום 29.10.2026 אשאיר את המפתח בתיבת הדואר שלך, אתעד ואודיע לך, ומאותו רגע תיחשב החזקה כמושבת לידייך.</w:t>
-      </w:r>
-    </w:p>
-    <w:p>
-      <w:pPr>
-        <w:pStyle w:val="ListParagraph"/>
-        <w:numPr>
-          <w:ilvl w:val="0"/>
-          <w:numId w:val="2"/>
-        </w:numPr>
-        <w:bidi/>
-        <w:spacing w:after="160" w:before="0" w:line="276"/>
-        <w:jc w:val="both"/>
-      </w:pPr>
-      <w:r>
-        <w:rPr>
-          <w:rFonts w:ascii="Arial" w:cs="Arial" w:hAnsi="Arial"/>
-          <w:sz w:val="22"/>
-          <w:szCs w:val="22"/>
-          <w:rtl/>
-        </w:rPr>
-        <w:t xml:space="preserve">במשך כל התקופה שמרתי על הדירה והמתנתי בסבלנות לתיקונים שבאחריותך לפי סעיף 18 לחוזה (המדרגה השבורה, הנזילה באסלה ודליפת גג המרפסת), בלי לדרוש פיצוי. אם הצ'קים לא יושבו במועד, אנקוט נגדך בהליכים משפטיים ללא התראה נוספת ועל חשבונך. הדברים שצוטטו מהשיחה מתועדים. מכתב זה נשלח לפי סעיף 14 לחוזה, ואין בו כדי לגרוע מכל זכות או טענה העומדות לי.</w:t>
+        <w:t xml:space="preserve">אבקש שתאשרי בכתב את קבלת התשלום ואת סיום ההתקשרות. אני מודה לך על השנה בדירה ומאחלת לך הצלחה בהשכרתה.</w:t>
       </w:r>
     </w:p>
     <w:p>

</xml_diff>